<commit_message>
Generación de documentos de oferta y póliza para fianzas
</commit_message>
<xml_diff>
--- a/Reportes/oferta_fianzas.docx
+++ b/Reportes/oferta_fianzas.docx
@@ -206,6 +206,16 @@
           <w:sz w:val="18"/>
         </w:rPr>
       </w:pPr>
+    </w:p>
+    <w:p>
+      <w:pPr>
+        <w:spacing w:before="94" w:after="7"/>
+        <w:ind w:right="482"/>
+        <w:jc w:val="right"/>
+        <w:rPr>
+          <w:sz w:val="18"/>
+        </w:rPr>
+      </w:pPr>
       <w:proofErr w:type="spellStart"/>
       <w:r>
         <w:rPr>
@@ -1004,13 +1014,7 @@
                                 <w:rPr>
                                   <w:sz w:val="18"/>
                                 </w:rPr>
-                                <w:t>custom</w:t>
-                              </w:r>
-                              <w:r>
-                                <w:rPr>
-                                  <w:sz w:val="18"/>
-                                </w:rPr>
-                                <w:t>.T</w:t>
+                                <w:t>custom.T</w:t>
                               </w:r>
                               <w:r>
                                 <w:rPr>
@@ -1921,13 +1925,7 @@
                           <w:rPr>
                             <w:sz w:val="18"/>
                           </w:rPr>
-                          <w:t>custom</w:t>
-                        </w:r>
-                        <w:r>
-                          <w:rPr>
-                            <w:sz w:val="18"/>
-                          </w:rPr>
-                          <w:t>.T</w:t>
+                          <w:t>custom.T</w:t>
                         </w:r>
                         <w:r>
                           <w:rPr>
@@ -3858,7 +3856,7 @@
                 </mc:Choice>
                 <mc:Fallback>
                   <w:pict>
-                    <v:group w14:anchorId="3716C875" id="Group 18" o:spid="_x0000_s1026" style="position:absolute;margin-left:-.85pt;margin-top:-.55pt;width:556.5pt;height:10.95pt;z-index:-15858176;mso-wrap-distance-left:0;mso-wrap-distance-right:0" coordsize="70675,1390" o:gfxdata="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">
+                    <v:group w14:anchorId="4BA70BDE" id="Group 18" o:spid="_x0000_s1026" style="position:absolute;margin-left:-.85pt;margin-top:-.55pt;width:556.5pt;height:10.95pt;z-index:-15858176;mso-wrap-distance-left:0;mso-wrap-distance-right:0" coordsize="70675,1390" o:gfxdata="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">
                       <v:shape id="Graphic 19" o:spid="_x0000_s1027" style="position:absolute;left:63;top:63;width:70549;height:1264;visibility:visible;mso-wrap-style:square;v-text-anchor:top" coordsize="7054850,126364" o:gfxdata="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" path="m7007225,l47625,,29200,3780,14049,14049,3780,29200,,47625,,78739,3780,97164r10269,15151l29200,122584r18425,3780l7007225,126364r18424,-3780l7040800,112315r10269,-15151l7054850,78739r,-31114l7051069,29200,7040800,14049,7025649,3780,7007225,xe" fillcolor="#dfdfdf" stroked="f">
                         <v:path arrowok="t"/>
                       </v:shape>
@@ -4328,7 +4326,7 @@
                 </mc:Choice>
                 <mc:Fallback>
                   <w:pict>
-                    <v:group w14:anchorId="1285EAD7" id="Group 21" o:spid="_x0000_s1026" style="position:absolute;margin-left:17.1pt;margin-top:-1.05pt;width:138.75pt;height:92.45pt;z-index:-15857664;mso-wrap-distance-left:0;mso-wrap-distance-right:0" coordsize="17621,11741" o:gfxdata="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">
+                    <v:group w14:anchorId="0CCA7CBD" id="Group 21" o:spid="_x0000_s1026" style="position:absolute;margin-left:17.1pt;margin-top:-1.05pt;width:138.75pt;height:92.45pt;z-index:-15857664;mso-wrap-distance-left:0;mso-wrap-distance-right:0" coordsize="17621,11741" o:gfxdata="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">
                       <v:shape id="Graphic 22" o:spid="_x0000_s1027" style="position:absolute;left:63;top:63;width:17494;height:11614;visibility:visible;mso-wrap-style:square;v-text-anchor:top" coordsize="1749425,1161415" o:gfxdata="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" path="m57150,l1692275,r22324,4464l1732756,16668r12204,18157l1749425,57150r,1047115l1744960,1126589r-12204,18157l1714599,1156950r-22324,4465l57150,1161415r-22325,-4465l16668,1144746,4464,1126589,,1104265,,57150,4464,34825,16668,16668,34825,4464,57150,e" filled="f" strokeweight="1pt">
                         <v:path arrowok="t"/>
                       </v:shape>
@@ -5749,190 +5747,60 @@
         <w:rPr>
           <w:sz w:val="6"/>
         </w:rPr>
-        <w:sectPr>
-          <w:type w:val="continuous"/>
-          <w:pgSz w:w="12240" w:h="15840"/>
-          <w:pgMar w:top="300" w:right="360" w:bottom="560" w:left="360" w:header="0" w:footer="373" w:gutter="0"/>
-          <w:cols w:space="720"/>
-        </w:sectPr>
-      </w:pPr>
-    </w:p>
-    <w:p>
-      <w:pPr>
-        <w:spacing w:before="83" w:line="326" w:lineRule="auto"/>
-        <w:ind w:left="8400"/>
-        <w:jc w:val="right"/>
-        <w:rPr>
-          <w:sz w:val="14"/>
-        </w:rPr>
-      </w:pPr>
-      <w:r>
-        <w:rPr>
-          <w:sz w:val="14"/>
-        </w:rPr>
-        <w:t>Firmado</w:t>
-      </w:r>
-      <w:r>
-        <w:rPr>
-          <w:rFonts w:ascii="Times New Roman"/>
-          <w:spacing w:val="-9"/>
-          <w:sz w:val="14"/>
-        </w:rPr>
-        <w:t xml:space="preserve"> </w:t>
-      </w:r>
-      <w:r>
-        <w:rPr>
-          <w:sz w:val="14"/>
-        </w:rPr>
-        <w:t>en</w:t>
-      </w:r>
-      <w:r>
-        <w:rPr>
-          <w:rFonts w:ascii="Times New Roman"/>
-          <w:spacing w:val="40"/>
-          <w:sz w:val="14"/>
-        </w:rPr>
-        <w:t xml:space="preserve"> </w:t>
-      </w:r>
-      <w:r>
-        <w:rPr>
-          <w:sz w:val="14"/>
-        </w:rPr>
-        <w:t>{</w:t>
-      </w:r>
-      <w:proofErr w:type="spellStart"/>
-      <w:proofErr w:type="gramStart"/>
-      <w:r>
-        <w:rPr>
-          <w:sz w:val="14"/>
-        </w:rPr>
-        <w:t>custom.</w:t>
-      </w:r>
-      <w:r>
-        <w:rPr>
-          <w:sz w:val="14"/>
-        </w:rPr>
-        <w:t>FechaActual</w:t>
-      </w:r>
-      <w:proofErr w:type="spellEnd"/>
-      <w:proofErr w:type="gramEnd"/>
-      <w:r>
-        <w:rPr>
-          <w:sz w:val="14"/>
-        </w:rPr>
-        <w:t>}</w:t>
-      </w:r>
-    </w:p>
-    <w:p>
-      <w:pPr>
-        <w:spacing w:before="83"/>
-        <w:ind w:left="76"/>
-        <w:rPr>
-          <w:rFonts w:ascii="Arial" w:hAnsi="Arial"/>
-          <w:b/>
-          <w:sz w:val="14"/>
-        </w:rPr>
-      </w:pPr>
-      <w:r>
-        <w:br w:type="column"/>
-      </w:r>
-      <w:r>
-        <w:rPr>
-          <w:rFonts w:ascii="Arial" w:hAnsi="Arial"/>
-          <w:b/>
-          <w:spacing w:val="-4"/>
-          <w:sz w:val="14"/>
-        </w:rPr>
-        <w:t>Panamá</w:t>
-      </w:r>
-    </w:p>
-    <w:p>
-      <w:pPr>
-        <w:spacing w:before="83"/>
-        <w:ind w:left="146"/>
-        <w:rPr>
-          <w:rFonts w:ascii="Arial" w:hAnsi="Arial"/>
-          <w:b/>
-          <w:sz w:val="14"/>
-        </w:rPr>
-      </w:pPr>
-      <w:r>
-        <w:br w:type="column"/>
-      </w:r>
-      <w:r>
-        <w:rPr>
-          <w:sz w:val="14"/>
-        </w:rPr>
-        <w:t>,</w:t>
-      </w:r>
-      <w:r>
-        <w:rPr>
-          <w:rFonts w:ascii="Times New Roman" w:hAnsi="Times New Roman"/>
-          <w:spacing w:val="5"/>
-          <w:sz w:val="14"/>
-        </w:rPr>
-        <w:t xml:space="preserve"> </w:t>
-      </w:r>
-      <w:r>
-        <w:rPr>
-          <w:sz w:val="14"/>
-        </w:rPr>
-        <w:t>R.</w:t>
-      </w:r>
-      <w:r>
-        <w:rPr>
-          <w:rFonts w:ascii="Times New Roman" w:hAnsi="Times New Roman"/>
-          <w:spacing w:val="6"/>
-          <w:sz w:val="14"/>
-        </w:rPr>
-        <w:t xml:space="preserve"> </w:t>
-      </w:r>
-      <w:r>
-        <w:rPr>
-          <w:sz w:val="14"/>
-        </w:rPr>
-        <w:t>de</w:t>
-      </w:r>
-      <w:r>
-        <w:rPr>
-          <w:rFonts w:ascii="Times New Roman" w:hAnsi="Times New Roman"/>
-          <w:spacing w:val="25"/>
-          <w:sz w:val="14"/>
-        </w:rPr>
-        <w:t xml:space="preserve"> </w:t>
-      </w:r>
-      <w:r>
-        <w:rPr>
-          <w:rFonts w:ascii="Arial" w:hAnsi="Arial"/>
-          <w:b/>
-          <w:spacing w:val="-2"/>
-          <w:sz w:val="14"/>
-        </w:rPr>
-        <w:t>Panamá</w:t>
-      </w:r>
-    </w:p>
-    <w:p>
-      <w:pPr>
-        <w:rPr>
-          <w:rFonts w:ascii="Arial" w:hAnsi="Arial"/>
-          <w:b/>
-          <w:sz w:val="14"/>
-        </w:rPr>
-        <w:sectPr>
-          <w:type w:val="continuous"/>
-          <w:pgSz w:w="12240" w:h="15840"/>
-          <w:pgMar w:top="300" w:right="360" w:bottom="560" w:left="360" w:header="0" w:footer="373" w:gutter="0"/>
-          <w:cols w:num="3" w:space="720" w:equalWidth="0">
-            <w:col w:w="9124" w:space="40"/>
-            <w:col w:w="610" w:space="39"/>
-            <w:col w:w="1707"/>
-          </w:cols>
-        </w:sectPr>
       </w:pPr>
     </w:p>
     <w:p>
       <w:pPr>
         <w:pStyle w:val="Textoindependiente"/>
+        <w:jc w:val="right"/>
+      </w:pPr>
+      <w:r>
+        <w:t xml:space="preserve">Firmado </w:t>
+      </w:r>
+      <w:r>
+        <w:t xml:space="preserve">en </w:t>
+      </w:r>
+      <w:r>
+        <w:rPr>
+          <w:b/>
+          <w:bCs/>
+        </w:rPr>
+        <w:t>Panamá</w:t>
+      </w:r>
+      <w:r>
+        <w:t xml:space="preserve">, R. de </w:t>
+      </w:r>
+      <w:r>
+        <w:rPr>
+          <w:b/>
+          <w:bCs/>
+        </w:rPr>
+        <w:t>Panamá</w:t>
+      </w:r>
+      <w:r>
+        <w:t xml:space="preserve"> {</w:t>
+      </w:r>
+      <w:proofErr w:type="spellStart"/>
+      <w:proofErr w:type="gramStart"/>
+      <w:r>
+        <w:t>custom.FechaActual</w:t>
+      </w:r>
+      <w:proofErr w:type="spellEnd"/>
+      <w:proofErr w:type="gramEnd"/>
+      <w:r>
+        <w:t>}</w:t>
+      </w:r>
+    </w:p>
+    <w:p>
+      <w:pPr>
+        <w:pStyle w:val="Textoindependiente"/>
+        <w:jc w:val="right"/>
+      </w:pPr>
+    </w:p>
+    <w:p>
+      <w:pPr>
+        <w:pStyle w:val="Textoindependiente"/>
+        <w:jc w:val="right"/>
         <w:rPr>
           <w:rFonts w:ascii="Arial"/>
           <w:b/>
@@ -6040,7 +5908,7 @@
           </mc:Choice>
           <mc:Fallback>
             <w:pict>
-              <v:group w14:anchorId="1E6CB6FD" id="Group 26" o:spid="_x0000_s1026" style="width:240pt;height:1pt;mso-position-horizontal-relative:char;mso-position-vertical-relative:line" coordsize="30480,127" o:gfxdata="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">
+              <v:group w14:anchorId="3B34D300" id="Group 26" o:spid="_x0000_s1026" style="width:240pt;height:1pt;mso-position-horizontal-relative:char;mso-position-vertical-relative:line" coordsize="30480,127" o:gfxdata="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">
                 <v:shape id="Graphic 27" o:spid="_x0000_s1027" style="position:absolute;top:63;width:30480;height:13;visibility:visible;mso-wrap-style:square;v-text-anchor:top" coordsize="3048000,1270" o:gfxdata="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" path="m,l3048000,e" filled="f" strokeweight="1pt">
                   <v:path arrowok="t"/>
                 </v:shape>
@@ -6134,7 +6002,7 @@
           </mc:Choice>
           <mc:Fallback>
             <w:pict>
-              <v:group w14:anchorId="58F9B502" id="Group 28" o:spid="_x0000_s1026" style="width:240pt;height:1pt;mso-position-horizontal-relative:char;mso-position-vertical-relative:line" coordsize="30480,127" o:gfxdata="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">
+              <v:group w14:anchorId="6341EA12" id="Group 28" o:spid="_x0000_s1026" style="width:240pt;height:1pt;mso-position-horizontal-relative:char;mso-position-vertical-relative:line" coordsize="30480,127" o:gfxdata="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">
                 <v:shape id="Graphic 29" o:spid="_x0000_s1027" style="position:absolute;top:63;width:30480;height:13;visibility:visible;mso-wrap-style:square;v-text-anchor:top" coordsize="3048000,1270" o:gfxdata="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" path="m,l3048000,e" filled="f" strokeweight="1pt">
                   <v:path arrowok="t"/>
                 </v:shape>

</xml_diff>